<commit_message>
Update Data Cleaning Policies.docx
</commit_message>
<xml_diff>
--- a/Data Governance/Data Cleaning Policies.docx
+++ b/Data Governance/Data Cleaning Policies.docx
@@ -834,23 +834,7 @@
                 <w:sz w:val="20"/>
                 <w:szCs w:val="20"/>
               </w:rPr>
-              <w:t xml:space="preserve">Missing Completely </w:t>
-            </w:r>
-            <w:proofErr w:type="gramStart"/>
-            <w:r>
-              <w:rPr>
-                <w:sz w:val="20"/>
-                <w:szCs w:val="20"/>
-              </w:rPr>
-              <w:t>At</w:t>
-            </w:r>
-            <w:proofErr w:type="gramEnd"/>
-            <w:r>
-              <w:rPr>
-                <w:sz w:val="20"/>
-                <w:szCs w:val="20"/>
-              </w:rPr>
-              <w:t xml:space="preserve"> Random — no pattern</w:t>
+              <w:t>Missing Completely At Random — no pattern</w:t>
             </w:r>
           </w:p>
         </w:tc>
@@ -1016,23 +1000,7 @@
                 <w:sz w:val="20"/>
                 <w:szCs w:val="20"/>
               </w:rPr>
-              <w:t xml:space="preserve">Missing Not </w:t>
-            </w:r>
-            <w:proofErr w:type="gramStart"/>
-            <w:r>
-              <w:rPr>
-                <w:sz w:val="20"/>
-                <w:szCs w:val="20"/>
-              </w:rPr>
-              <w:t>At</w:t>
-            </w:r>
-            <w:proofErr w:type="gramEnd"/>
-            <w:r>
-              <w:rPr>
-                <w:sz w:val="20"/>
-                <w:szCs w:val="20"/>
-              </w:rPr>
-              <w:t xml:space="preserve"> Random — related to unobserved data</w:t>
+              <w:t>Missing Not At Random — related to unobserved data</w:t>
             </w:r>
           </w:p>
         </w:tc>
@@ -4141,9 +4109,35 @@
     </w:p>
     <w:p>
       <w:pPr>
+        <w:spacing w:before="80" w:after="80"/>
+      </w:pPr>
+    </w:p>
+    <w:p>
+      <w:pPr>
+        <w:spacing w:before="80" w:after="80"/>
+      </w:pPr>
+    </w:p>
+    <w:p>
+      <w:pPr>
+        <w:spacing w:before="80" w:after="80"/>
+      </w:pPr>
+    </w:p>
+    <w:p>
+      <w:pPr>
+        <w:spacing w:before="80" w:after="80"/>
+      </w:pPr>
+    </w:p>
+    <w:p>
+      <w:pPr>
+        <w:spacing w:before="80" w:after="80"/>
+      </w:pPr>
+    </w:p>
+    <w:p>
+      <w:pPr>
         <w:pStyle w:val="Heading2"/>
       </w:pPr>
       <w:r>
+        <w:lastRenderedPageBreak/>
         <w:t>5.1  Detection Methods</w:t>
       </w:r>
     </w:p>
@@ -4371,7 +4365,6 @@
                 <w:sz w:val="20"/>
                 <w:szCs w:val="20"/>
               </w:rPr>
-              <w:lastRenderedPageBreak/>
               <w:t>IQR (Interquartile Range)</w:t>
             </w:r>
           </w:p>
@@ -5253,21 +5246,6 @@
       <w:r>
         <w:t>Outlier detection thresholds must be reviewed and validated against domain knowledge at least once per quarter.</w:t>
       </w:r>
-    </w:p>
-    <w:p>
-      <w:pPr>
-        <w:spacing w:before="80" w:after="80"/>
-      </w:pPr>
-    </w:p>
-    <w:p>
-      <w:pPr>
-        <w:spacing w:before="80" w:after="80"/>
-      </w:pPr>
-    </w:p>
-    <w:p>
-      <w:pPr>
-        <w:spacing w:before="80" w:after="80"/>
-      </w:pPr>
     </w:p>
     <w:p>
       <w:pPr>

</xml_diff>